<commit_message>
Thai Phase-3 docx: fold in 3e generality wave (spot/bob/fandisk)
Data-driven sections pick the three new shapes up from results.json; adds
the 4b generality intro (ShapeNet-substitution rationale + honest spot
caveat), finding no.5, and updates the coverage caveat + next-steps to
match PHASE3_STATUS.md.

Co-Authored-By: Claude Fable 5 <noreply@anthropic.com>
</commit_message>
<xml_diff>
--- a/docs/CG-Soup_Topology_Phase3_TH.docx
+++ b/docs/CG-Soup_Topology_Phase3_TH.docx
@@ -38,7 +38,7 @@
           <w:rFonts w:ascii="Tahoma" w:hAnsi="Tahoma"/>
           <w:sz w:val="20"/>
         </w:rPr>
-        <w:t>การเทียบแบบควบคุม C0/C1/C2/C3/C5 · Chamfer parity · เฉลี่ยข้าม seeds · อ่านตัวเลขจากไฟล์ผลจริง · 7 กรกฎาคม 2569</w:t>
+        <w:t>การเทียบแบบควบคุม C0/C1/C2/C3/C5 · Chamfer parity · เฉลี่ยข้าม seeds · อ่านตัวเลขจากไฟล์ผลจริง · อัปเดตคลื่น 3e (ความทั่วไป) · 9 กรกฎาคม 2569</w:t>
       </w:r>
     </w:p>
     <w:p/>
@@ -75,7 +75,7 @@
           <w:rFonts w:ascii="Tahoma" w:hAnsi="Tahoma"/>
           <w:sz w:val="21"/>
         </w:rPr>
-        <w:t>ผลหลัก: loss ให้กำไรเชิงโทโพโลยีแท้ (ชนะทั้งเบสไลน์และตัวควบคุมที่ปรับขนาด gradient เท่ากัน) ทั้งกับโพรง H2 (ลด error 4.0–7.9 เท่า) และ — จุดที่ resampling ทำไม่ได้ — ห่วง H1 (2.4 เท่า โดยไม่สร้าง phantom handle เลยแม้แต่ seed เดียว) และสองช่องทางเสริมกัน: loss + prior (C5) ดีที่สุดในทุกรูปทรงที่ทดสอบ ส่วน H0 ยังคง ‘ไม่ใช่เรื่องโทโพโลยี’ เป็นครั้งที่สามข้ามทุกช่องทาง</w:t>
+        <w:t>ผลหลัก: loss ให้กำไรเชิงโทโพโลยีแท้ (ชนะทั้งเบสไลน์และตัวควบคุมที่ปรับขนาด gradient เท่ากัน) ทั้งกับโพรง H2 (ลด error 4.0–7.9 เท่า) และ — จุดที่ resampling ทำไม่ได้ — ห่วง H1 (2.4 เท่า โดยไม่สร้าง phantom handle เลยแม้แต่ seed เดียว) และสองช่องทางเสริมกัน: loss + prior (C5) ดีที่สุดในทุกรูปทรงที่ทดสอบ ส่วน H0 ยังคง ‘ไม่ใช่เรื่องโทโพโลยี’ เป็นครั้งที่สามข้ามทุกช่องทาง และล่าสุด (คลื่น 3e) ทุก verdict เกิดซ้ำบนเมชภายนอกสามชิ้นที่รู้ genus โดยไม่จูนอะไรต่อรูปทรงเลย (2.0–10.3 เท่า ที่ Chamfer ดีกว่าเบสไลน์ทุกชิ้น)</w:t>
       </w:r>
     </w:p>
     <w:p>
@@ -4566,6 +4566,1905 @@
     </w:p>
     <w:p>
       <w:pPr>
+        <w:pStyle w:val="Heading2"/>
+      </w:pPr>
+      <w:r>
+        <w:rPr>
+          <w:rFonts w:ascii="Tahoma" w:hAnsi="Tahoma"/>
+          <w:color w:val="1F4E79"/>
+        </w:rPr>
+        <w:t>4b. คลื่น 3e — ความทั่วไปบนเมชภายนอกที่รู้ genus (9 ก.ค. 2569)</w:t>
+      </w:r>
+    </w:p>
+    <w:p>
+      <w:pPr>
+        <w:spacing w:after="120"/>
+      </w:pPr>
+      <w:r>
+        <w:rPr>
+          <w:rFonts w:ascii="Tahoma" w:hAnsi="Tahoma"/>
+          <w:sz w:val="21"/>
+        </w:rPr>
+        <w:t>ทำซ้ำโปรโตคอลเดิมทุกอย่าง (C0/C1/C2 × 3 seeds, ρ, ramp, งบต่อคลาสเท่าเดิม, ไม่จูนอะไรต่อรูปทรง) บนเมชภายนอกสามชิ้นที่ตรวจ watertight และ genus แล้ว: spot (วัว, genus 0) กับ bob (เป็ด, genus 1) จากคลังโมเดลของ Keenan Crane (CC0) และ fandisk (ชิ้นงาน CAD, genus 0) — ใช้แทน ShapeNet ซึ่งเมชส่วนใหญ่ไม่ watertight จึงไม่มี ground truth เชิงโทโพโลยีที่เชื่อถือได้ ผล: ผ่านทั้ง 3/3 ที่ Chamfer ดีกว่าเบสไลน์ทุกชิ้น (2.0–10.3 เท่า) และโหมดล้มเหลวของตัวควบคุมเกิดซ้ำเป๊ะ (โพรงถูกลบทิ้งบนทั้งสองชิ้น H2, ห่วงหายหนึ่งวงบน genus-1) หมายเหตุตรงไปตรงมา: บน spot เบสไลน์เองสร้างโพรงปลอมใน 2/3 seeds และ C1 แก้ได้ 2 ใน 3 seeds — การซ่อม ‘ค่า’ (bottleneck) เชื่อถือได้ แต่การซ่อม ‘จำนวน’ บนรายละเอียดอินทรีย์ ที่เล็กกว่างบ (ขา/เขา ที่ N=1200) เป็นการปรับปรุง ไม่ใช่การรับประกัน</w:t>
+      </w:r>
+    </w:p>
+    <w:p>
+      <w:pPr>
+        <w:pStyle w:val="Heading2"/>
+      </w:pPr>
+      <w:r>
+        <w:rPr>
+          <w:rFonts w:ascii="Tahoma" w:hAnsi="Tahoma"/>
+          <w:color w:val="1F4E79"/>
+        </w:rPr>
+        <w:t>4.6 spot — โมเดลวัว genus-0 (Crane, CC0) — มิติชี้ขาด H2 (โพรงปิด/voids)</w:t>
+      </w:r>
+    </w:p>
+    <w:tbl>
+      <w:tblPr>
+        <w:tblStyle w:val="TableGrid"/>
+        <w:tblW w:type="auto" w:w="0"/>
+        <w:jc w:val="center"/>
+        <w:tblLook w:firstColumn="1" w:firstRow="1" w:lastColumn="0" w:lastRow="0" w:noHBand="0" w:noVBand="1" w:val="04A0"/>
+      </w:tblPr>
+      <w:tblGrid>
+        <w:gridCol w:w="1440"/>
+        <w:gridCol w:w="1440"/>
+        <w:gridCol w:w="1440"/>
+        <w:gridCol w:w="1440"/>
+        <w:gridCol w:w="1440"/>
+        <w:gridCol w:w="1440"/>
+      </w:tblGrid>
+      <w:tr>
+        <w:tc>
+          <w:tcPr>
+            <w:tcW w:type="dxa" w:w="2448"/>
+            <w:shd w:val="clear" w:fill="1F4E79"/>
+          </w:tcPr>
+          <w:p>
+            <w:pPr>
+              <w:spacing w:after="0"/>
+            </w:pPr>
+            <w:r/>
+            <w:r>
+              <w:rPr>
+                <w:rFonts w:ascii="Tahoma" w:hAnsi="Tahoma"/>
+                <w:b/>
+                <w:color w:val="FFFFFF"/>
+                <w:sz w:val="18"/>
+              </w:rPr>
+              <w:t>เงื่อนไข</w:t>
+            </w:r>
+          </w:p>
+        </w:tc>
+        <w:tc>
+          <w:tcPr>
+            <w:tcW w:type="dxa" w:w="864"/>
+            <w:shd w:val="clear" w:fill="1F4E79"/>
+          </w:tcPr>
+          <w:p>
+            <w:pPr>
+              <w:spacing w:after="0"/>
+            </w:pPr>
+            <w:r/>
+            <w:r>
+              <w:rPr>
+                <w:rFonts w:ascii="Tahoma" w:hAnsi="Tahoma"/>
+                <w:b/>
+                <w:color w:val="FFFFFF"/>
+                <w:sz w:val="18"/>
+              </w:rPr>
+              <w:t>seeds</w:t>
+            </w:r>
+          </w:p>
+        </w:tc>
+        <w:tc>
+          <w:tcPr>
+            <w:tcW w:type="dxa" w:w="2304"/>
+            <w:shd w:val="clear" w:fill="1F4E79"/>
+          </w:tcPr>
+          <w:p>
+            <w:pPr>
+              <w:spacing w:after="0"/>
+            </w:pPr>
+            <w:r/>
+            <w:r>
+              <w:rPr>
+                <w:rFonts w:ascii="Tahoma" w:hAnsi="Tahoma"/>
+                <w:b/>
+                <w:color w:val="FFFFFF"/>
+                <w:sz w:val="18"/>
+              </w:rPr>
+              <w:t>bottleneck H2 (ท้ายการเทรน)</w:t>
+            </w:r>
+          </w:p>
+        </w:tc>
+        <w:tc>
+          <w:tcPr>
+            <w:tcW w:type="dxa" w:w="1152"/>
+            <w:shd w:val="clear" w:fill="1F4E79"/>
+          </w:tcPr>
+          <w:p>
+            <w:pPr>
+              <w:spacing w:after="0"/>
+            </w:pPr>
+            <w:r/>
+            <w:r>
+              <w:rPr>
+                <w:rFonts w:ascii="Tahoma" w:hAnsi="Tahoma"/>
+                <w:b/>
+                <w:color w:val="FFFFFF"/>
+                <w:sz w:val="18"/>
+              </w:rPr>
+              <w:t>เทียบ C0</w:t>
+            </w:r>
+          </w:p>
+        </w:tc>
+        <w:tc>
+          <w:tcPr>
+            <w:tcW w:type="dxa" w:w="1296"/>
+            <w:shd w:val="clear" w:fill="1F4E79"/>
+          </w:tcPr>
+          <w:p>
+            <w:pPr>
+              <w:spacing w:after="0"/>
+            </w:pPr>
+            <w:r/>
+            <w:r>
+              <w:rPr>
+                <w:rFonts w:ascii="Tahoma" w:hAnsi="Tahoma"/>
+                <w:b/>
+                <w:color w:val="FFFFFF"/>
+                <w:sz w:val="18"/>
+              </w:rPr>
+              <w:t>Chamfer%</w:t>
+            </w:r>
+          </w:p>
+        </w:tc>
+        <w:tc>
+          <w:tcPr>
+            <w:tcW w:type="dxa" w:w="1440"/>
+            <w:shd w:val="clear" w:fill="1F4E79"/>
+          </w:tcPr>
+          <w:p>
+            <w:pPr>
+              <w:spacing w:after="0"/>
+            </w:pPr>
+            <w:r/>
+            <w:r>
+              <w:rPr>
+                <w:rFonts w:ascii="Tahoma" w:hAnsi="Tahoma"/>
+                <w:b/>
+                <w:color w:val="FFFFFF"/>
+                <w:sz w:val="18"/>
+              </w:rPr>
+              <w:t>#sig สุดท้าย</w:t>
+            </w:r>
+          </w:p>
+        </w:tc>
+      </w:tr>
+      <w:tr>
+        <w:tc>
+          <w:tcPr>
+            <w:tcW w:type="dxa" w:w="2448"/>
+          </w:tcPr>
+          <w:p>
+            <w:pPr>
+              <w:spacing w:after="0"/>
+            </w:pPr>
+            <w:r/>
+            <w:r>
+              <w:rPr>
+                <w:rFonts w:ascii="Tahoma" w:hAnsi="Tahoma"/>
+                <w:b w:val="0"/>
+                <w:sz w:val="18"/>
+              </w:rPr>
+              <w:t>C0 เบสไลน์</w:t>
+            </w:r>
+          </w:p>
+        </w:tc>
+        <w:tc>
+          <w:tcPr>
+            <w:tcW w:type="dxa" w:w="864"/>
+          </w:tcPr>
+          <w:p>
+            <w:pPr>
+              <w:spacing w:after="0"/>
+            </w:pPr>
+            <w:r/>
+            <w:r>
+              <w:rPr>
+                <w:rFonts w:ascii="Tahoma" w:hAnsi="Tahoma"/>
+                <w:b w:val="0"/>
+                <w:sz w:val="18"/>
+              </w:rPr>
+              <w:t>3</w:t>
+            </w:r>
+          </w:p>
+        </w:tc>
+        <w:tc>
+          <w:tcPr>
+            <w:tcW w:type="dxa" w:w="2304"/>
+          </w:tcPr>
+          <w:p>
+            <w:pPr>
+              <w:spacing w:after="0"/>
+            </w:pPr>
+            <w:r/>
+            <w:r>
+              <w:rPr>
+                <w:rFonts w:ascii="Tahoma" w:hAnsi="Tahoma"/>
+                <w:b w:val="0"/>
+                <w:sz w:val="18"/>
+              </w:rPr>
+              <w:t>0.0521 ± 0.0081</w:t>
+            </w:r>
+          </w:p>
+        </w:tc>
+        <w:tc>
+          <w:tcPr>
+            <w:tcW w:type="dxa" w:w="1152"/>
+          </w:tcPr>
+          <w:p>
+            <w:pPr>
+              <w:spacing w:after="0"/>
+            </w:pPr>
+            <w:r/>
+            <w:r>
+              <w:rPr>
+                <w:rFonts w:ascii="Tahoma" w:hAnsi="Tahoma"/>
+                <w:b w:val="0"/>
+                <w:sz w:val="18"/>
+              </w:rPr>
+              <w:t>—</w:t>
+            </w:r>
+          </w:p>
+        </w:tc>
+        <w:tc>
+          <w:tcPr>
+            <w:tcW w:type="dxa" w:w="1296"/>
+          </w:tcPr>
+          <w:p>
+            <w:pPr>
+              <w:spacing w:after="0"/>
+            </w:pPr>
+            <w:r/>
+            <w:r>
+              <w:rPr>
+                <w:rFonts w:ascii="Tahoma" w:hAnsi="Tahoma"/>
+                <w:b w:val="0"/>
+                <w:sz w:val="18"/>
+              </w:rPr>
+              <w:t>0.944</w:t>
+            </w:r>
+          </w:p>
+        </w:tc>
+        <w:tc>
+          <w:tcPr>
+            <w:tcW w:type="dxa" w:w="1440"/>
+          </w:tcPr>
+          <w:p>
+            <w:pPr>
+              <w:spacing w:after="0"/>
+            </w:pPr>
+            <w:r/>
+            <w:r>
+              <w:rPr>
+                <w:rFonts w:ascii="Tahoma" w:hAnsi="Tahoma"/>
+                <w:b w:val="0"/>
+                <w:sz w:val="18"/>
+              </w:rPr>
+              <w:t>[2, 1, 2]</w:t>
+            </w:r>
+          </w:p>
+        </w:tc>
+      </w:tr>
+      <w:tr>
+        <w:tc>
+          <w:tcPr>
+            <w:tcW w:type="dxa" w:w="2448"/>
+          </w:tcPr>
+          <w:p>
+            <w:pPr>
+              <w:spacing w:after="0"/>
+            </w:pPr>
+            <w:r/>
+            <w:r>
+              <w:rPr>
+                <w:rFonts w:ascii="Tahoma" w:hAnsi="Tahoma"/>
+                <w:b w:val="0"/>
+                <w:sz w:val="18"/>
+              </w:rPr>
+              <w:t>C1 topological loss</w:t>
+            </w:r>
+          </w:p>
+        </w:tc>
+        <w:tc>
+          <w:tcPr>
+            <w:tcW w:type="dxa" w:w="864"/>
+          </w:tcPr>
+          <w:p>
+            <w:pPr>
+              <w:spacing w:after="0"/>
+            </w:pPr>
+            <w:r/>
+            <w:r>
+              <w:rPr>
+                <w:rFonts w:ascii="Tahoma" w:hAnsi="Tahoma"/>
+                <w:b w:val="0"/>
+                <w:sz w:val="18"/>
+              </w:rPr>
+              <w:t>3</w:t>
+            </w:r>
+          </w:p>
+        </w:tc>
+        <w:tc>
+          <w:tcPr>
+            <w:tcW w:type="dxa" w:w="2304"/>
+          </w:tcPr>
+          <w:p>
+            <w:pPr>
+              <w:spacing w:after="0"/>
+            </w:pPr>
+            <w:r/>
+            <w:r>
+              <w:rPr>
+                <w:rFonts w:ascii="Tahoma" w:hAnsi="Tahoma"/>
+                <w:b w:val="0"/>
+                <w:sz w:val="18"/>
+              </w:rPr>
+              <w:t>0.0237 ± 0.0000</w:t>
+            </w:r>
+          </w:p>
+        </w:tc>
+        <w:tc>
+          <w:tcPr>
+            <w:tcW w:type="dxa" w:w="1152"/>
+          </w:tcPr>
+          <w:p>
+            <w:pPr>
+              <w:spacing w:after="0"/>
+            </w:pPr>
+            <w:r/>
+            <w:r>
+              <w:rPr>
+                <w:rFonts w:ascii="Tahoma" w:hAnsi="Tahoma"/>
+                <w:b w:val="0"/>
+                <w:sz w:val="18"/>
+              </w:rPr>
+              <w:t>2.2×</w:t>
+            </w:r>
+          </w:p>
+        </w:tc>
+        <w:tc>
+          <w:tcPr>
+            <w:tcW w:type="dxa" w:w="1296"/>
+          </w:tcPr>
+          <w:p>
+            <w:pPr>
+              <w:spacing w:after="0"/>
+            </w:pPr>
+            <w:r/>
+            <w:r>
+              <w:rPr>
+                <w:rFonts w:ascii="Tahoma" w:hAnsi="Tahoma"/>
+                <w:b w:val="0"/>
+                <w:sz w:val="18"/>
+              </w:rPr>
+              <w:t>0.853</w:t>
+            </w:r>
+          </w:p>
+        </w:tc>
+        <w:tc>
+          <w:tcPr>
+            <w:tcW w:type="dxa" w:w="1440"/>
+          </w:tcPr>
+          <w:p>
+            <w:pPr>
+              <w:spacing w:after="0"/>
+            </w:pPr>
+            <w:r/>
+            <w:r>
+              <w:rPr>
+                <w:rFonts w:ascii="Tahoma" w:hAnsi="Tahoma"/>
+                <w:b w:val="0"/>
+                <w:sz w:val="18"/>
+              </w:rPr>
+              <w:t>[1, 2, 1]</w:t>
+            </w:r>
+          </w:p>
+        </w:tc>
+      </w:tr>
+      <w:tr>
+        <w:tc>
+          <w:tcPr>
+            <w:tcW w:type="dxa" w:w="2448"/>
+          </w:tcPr>
+          <w:p>
+            <w:pPr>
+              <w:spacing w:after="0"/>
+            </w:pPr>
+            <w:r/>
+            <w:r>
+              <w:rPr>
+                <w:rFonts w:ascii="Tahoma" w:hAnsi="Tahoma"/>
+                <w:b w:val="0"/>
+                <w:sz w:val="18"/>
+              </w:rPr>
+              <w:t>C2 ตัวควบคุม (repulsion)</w:t>
+            </w:r>
+          </w:p>
+        </w:tc>
+        <w:tc>
+          <w:tcPr>
+            <w:tcW w:type="dxa" w:w="864"/>
+          </w:tcPr>
+          <w:p>
+            <w:pPr>
+              <w:spacing w:after="0"/>
+            </w:pPr>
+            <w:r/>
+            <w:r>
+              <w:rPr>
+                <w:rFonts w:ascii="Tahoma" w:hAnsi="Tahoma"/>
+                <w:b w:val="0"/>
+                <w:sz w:val="18"/>
+              </w:rPr>
+              <w:t>3</w:t>
+            </w:r>
+          </w:p>
+        </w:tc>
+        <w:tc>
+          <w:tcPr>
+            <w:tcW w:type="dxa" w:w="2304"/>
+          </w:tcPr>
+          <w:p>
+            <w:pPr>
+              <w:spacing w:after="0"/>
+            </w:pPr>
+            <w:r/>
+            <w:r>
+              <w:rPr>
+                <w:rFonts w:ascii="Tahoma" w:hAnsi="Tahoma"/>
+                <w:b w:val="0"/>
+                <w:sz w:val="18"/>
+              </w:rPr>
+              <w:t>0.0652 ± 0.0000</w:t>
+            </w:r>
+          </w:p>
+        </w:tc>
+        <w:tc>
+          <w:tcPr>
+            <w:tcW w:type="dxa" w:w="1152"/>
+          </w:tcPr>
+          <w:p>
+            <w:pPr>
+              <w:spacing w:after="0"/>
+            </w:pPr>
+            <w:r/>
+            <w:r>
+              <w:rPr>
+                <w:rFonts w:ascii="Tahoma" w:hAnsi="Tahoma"/>
+                <w:b w:val="0"/>
+                <w:sz w:val="18"/>
+              </w:rPr>
+              <w:t>0.8×</w:t>
+            </w:r>
+          </w:p>
+        </w:tc>
+        <w:tc>
+          <w:tcPr>
+            <w:tcW w:type="dxa" w:w="1296"/>
+          </w:tcPr>
+          <w:p>
+            <w:pPr>
+              <w:spacing w:after="0"/>
+            </w:pPr>
+            <w:r/>
+            <w:r>
+              <w:rPr>
+                <w:rFonts w:ascii="Tahoma" w:hAnsi="Tahoma"/>
+                <w:b w:val="0"/>
+                <w:sz w:val="18"/>
+              </w:rPr>
+              <w:t>1.888</w:t>
+            </w:r>
+          </w:p>
+        </w:tc>
+        <w:tc>
+          <w:tcPr>
+            <w:tcW w:type="dxa" w:w="1440"/>
+          </w:tcPr>
+          <w:p>
+            <w:pPr>
+              <w:spacing w:after="0"/>
+            </w:pPr>
+            <w:r/>
+            <w:r>
+              <w:rPr>
+                <w:rFonts w:ascii="Tahoma" w:hAnsi="Tahoma"/>
+                <w:b w:val="0"/>
+                <w:sz w:val="18"/>
+              </w:rPr>
+              <w:t>[0, 0, 0]</w:t>
+            </w:r>
+          </w:p>
+        </w:tc>
+      </w:tr>
+    </w:tbl>
+    <w:p>
+      <w:pPr>
+        <w:spacing w:after="80"/>
+      </w:pPr>
+    </w:p>
+    <w:p>
+      <w:pPr>
+        <w:spacing w:after="120"/>
+      </w:pPr>
+      <w:r>
+        <w:rPr>
+          <w:rFonts w:ascii="Tahoma" w:hAnsi="Tahoma"/>
+          <w:sz w:val="19"/>
+        </w:rPr>
+        <w:t>คำตัดสิน (C1 ต้องชนะทั้ง C0 และตัวควบคุมทุกตัวที่ Chamfer parity): ผ่าน ✓ — C1 0.0237 vs C0 0.0521 (6.1 sigma); vs C2 0.0652; Chamfer 0.853 vs C0 0.944 (parity OK)</w:t>
+      </w:r>
+    </w:p>
+    <w:p>
+      <w:pPr>
+        <w:jc w:val="center"/>
+      </w:pPr>
+      <w:r>
+        <w:drawing>
+          <wp:inline xmlns:a="http://schemas.openxmlformats.org/drawingml/2006/main" xmlns:pic="http://schemas.openxmlformats.org/drawingml/2006/picture">
+            <wp:extent cx="5303520" cy="3182112"/>
+            <wp:docPr id="11" name="Picture 11"/>
+            <wp:cNvGraphicFramePr>
+              <a:graphicFrameLocks noChangeAspect="1"/>
+            </wp:cNvGraphicFramePr>
+            <a:graphic>
+              <a:graphicData uri="http://schemas.openxmlformats.org/drawingml/2006/picture">
+                <pic:pic>
+                  <pic:nvPicPr>
+                    <pic:cNvPr id="0" name="spot_series.png"/>
+                    <pic:cNvPicPr/>
+                  </pic:nvPicPr>
+                  <pic:blipFill>
+                    <a:blip r:embed="rId19"/>
+                    <a:stretch>
+                      <a:fillRect/>
+                    </a:stretch>
+                  </pic:blipFill>
+                  <pic:spPr>
+                    <a:xfrm>
+                      <a:off x="0" y="0"/>
+                      <a:ext cx="5303520" cy="3182112"/>
+                    </a:xfrm>
+                    <a:prstGeom prst="rect"/>
+                  </pic:spPr>
+                </pic:pic>
+              </a:graphicData>
+            </a:graphic>
+          </wp:inline>
+        </w:drawing>
+      </w:r>
+    </w:p>
+    <w:p>
+      <w:pPr>
+        <w:jc w:val="center"/>
+      </w:pPr>
+      <w:r>
+        <w:rPr>
+          <w:i/>
+          <w:color w:val="555555"/>
+          <w:sz w:val="17"/>
+        </w:rPr>
+        <w:t>spot — โมเดลวัว genus-0 (Crane, CC0) — ค่า error เชิงโทโพโลยีระหว่างการเทรน (แถบ = ช่วง min–max ข้าม seeds)</w:t>
+      </w:r>
+    </w:p>
+    <w:p>
+      <w:pPr>
+        <w:jc w:val="center"/>
+      </w:pPr>
+      <w:r>
+        <w:drawing>
+          <wp:inline xmlns:a="http://schemas.openxmlformats.org/drawingml/2006/main" xmlns:pic="http://schemas.openxmlformats.org/drawingml/2006/picture">
+            <wp:extent cx="5303520" cy="2727525"/>
+            <wp:docPr id="12" name="Picture 12"/>
+            <wp:cNvGraphicFramePr>
+              <a:graphicFrameLocks noChangeAspect="1"/>
+            </wp:cNvGraphicFramePr>
+            <a:graphic>
+              <a:graphicData uri="http://schemas.openxmlformats.org/drawingml/2006/picture">
+                <pic:pic>
+                  <pic:nvPicPr>
+                    <pic:cNvPr id="0" name="spot_nsig.png"/>
+                    <pic:cNvPicPr/>
+                  </pic:nvPicPr>
+                  <pic:blipFill>
+                    <a:blip r:embed="rId20"/>
+                    <a:stretch>
+                      <a:fillRect/>
+                    </a:stretch>
+                  </pic:blipFill>
+                  <pic:spPr>
+                    <a:xfrm>
+                      <a:off x="0" y="0"/>
+                      <a:ext cx="5303520" cy="2727525"/>
+                    </a:xfrm>
+                    <a:prstGeom prst="rect"/>
+                  </pic:spPr>
+                </pic:pic>
+              </a:graphicData>
+            </a:graphic>
+          </wp:inline>
+        </w:drawing>
+      </w:r>
+    </w:p>
+    <w:p>
+      <w:pPr>
+        <w:jc w:val="center"/>
+      </w:pPr>
+      <w:r>
+        <w:rPr>
+          <w:i/>
+          <w:color w:val="555555"/>
+          <w:sz w:val="17"/>
+        </w:rPr>
+        <w:t>spot — โมเดลวัว genus-0 (Crane, CC0) — จำนวน feature ที่มีนัยยะ (เช็ค phantom; เส้นประ = ค่าที่ถูกต้อง)</w:t>
+      </w:r>
+    </w:p>
+    <w:p>
+      <w:pPr>
+        <w:pStyle w:val="Heading2"/>
+      </w:pPr>
+      <w:r>
+        <w:rPr>
+          <w:rFonts w:ascii="Tahoma" w:hAnsi="Tahoma"/>
+          <w:color w:val="1F4E79"/>
+        </w:rPr>
+        <w:t>4.7 bob — โมเดลเป็ด genus-1 (Crane, CC0) — มิติชี้ขาด H1 (ห่วง·หูจับ/loops·handles)</w:t>
+      </w:r>
+    </w:p>
+    <w:tbl>
+      <w:tblPr>
+        <w:tblStyle w:val="TableGrid"/>
+        <w:tblW w:type="auto" w:w="0"/>
+        <w:jc w:val="center"/>
+        <w:tblLook w:firstColumn="1" w:firstRow="1" w:lastColumn="0" w:lastRow="0" w:noHBand="0" w:noVBand="1" w:val="04A0"/>
+      </w:tblPr>
+      <w:tblGrid>
+        <w:gridCol w:w="1440"/>
+        <w:gridCol w:w="1440"/>
+        <w:gridCol w:w="1440"/>
+        <w:gridCol w:w="1440"/>
+        <w:gridCol w:w="1440"/>
+        <w:gridCol w:w="1440"/>
+      </w:tblGrid>
+      <w:tr>
+        <w:tc>
+          <w:tcPr>
+            <w:tcW w:type="dxa" w:w="2448"/>
+            <w:shd w:val="clear" w:fill="1F4E79"/>
+          </w:tcPr>
+          <w:p>
+            <w:pPr>
+              <w:spacing w:after="0"/>
+            </w:pPr>
+            <w:r/>
+            <w:r>
+              <w:rPr>
+                <w:rFonts w:ascii="Tahoma" w:hAnsi="Tahoma"/>
+                <w:b/>
+                <w:color w:val="FFFFFF"/>
+                <w:sz w:val="18"/>
+              </w:rPr>
+              <w:t>เงื่อนไข</w:t>
+            </w:r>
+          </w:p>
+        </w:tc>
+        <w:tc>
+          <w:tcPr>
+            <w:tcW w:type="dxa" w:w="864"/>
+            <w:shd w:val="clear" w:fill="1F4E79"/>
+          </w:tcPr>
+          <w:p>
+            <w:pPr>
+              <w:spacing w:after="0"/>
+            </w:pPr>
+            <w:r/>
+            <w:r>
+              <w:rPr>
+                <w:rFonts w:ascii="Tahoma" w:hAnsi="Tahoma"/>
+                <w:b/>
+                <w:color w:val="FFFFFF"/>
+                <w:sz w:val="18"/>
+              </w:rPr>
+              <w:t>seeds</w:t>
+            </w:r>
+          </w:p>
+        </w:tc>
+        <w:tc>
+          <w:tcPr>
+            <w:tcW w:type="dxa" w:w="2304"/>
+            <w:shd w:val="clear" w:fill="1F4E79"/>
+          </w:tcPr>
+          <w:p>
+            <w:pPr>
+              <w:spacing w:after="0"/>
+            </w:pPr>
+            <w:r/>
+            <w:r>
+              <w:rPr>
+                <w:rFonts w:ascii="Tahoma" w:hAnsi="Tahoma"/>
+                <w:b/>
+                <w:color w:val="FFFFFF"/>
+                <w:sz w:val="18"/>
+              </w:rPr>
+              <w:t>bottleneck H1 (ท้ายการเทรน)</w:t>
+            </w:r>
+          </w:p>
+        </w:tc>
+        <w:tc>
+          <w:tcPr>
+            <w:tcW w:type="dxa" w:w="1152"/>
+            <w:shd w:val="clear" w:fill="1F4E79"/>
+          </w:tcPr>
+          <w:p>
+            <w:pPr>
+              <w:spacing w:after="0"/>
+            </w:pPr>
+            <w:r/>
+            <w:r>
+              <w:rPr>
+                <w:rFonts w:ascii="Tahoma" w:hAnsi="Tahoma"/>
+                <w:b/>
+                <w:color w:val="FFFFFF"/>
+                <w:sz w:val="18"/>
+              </w:rPr>
+              <w:t>เทียบ C0</w:t>
+            </w:r>
+          </w:p>
+        </w:tc>
+        <w:tc>
+          <w:tcPr>
+            <w:tcW w:type="dxa" w:w="1296"/>
+            <w:shd w:val="clear" w:fill="1F4E79"/>
+          </w:tcPr>
+          <w:p>
+            <w:pPr>
+              <w:spacing w:after="0"/>
+            </w:pPr>
+            <w:r/>
+            <w:r>
+              <w:rPr>
+                <w:rFonts w:ascii="Tahoma" w:hAnsi="Tahoma"/>
+                <w:b/>
+                <w:color w:val="FFFFFF"/>
+                <w:sz w:val="18"/>
+              </w:rPr>
+              <w:t>Chamfer%</w:t>
+            </w:r>
+          </w:p>
+        </w:tc>
+        <w:tc>
+          <w:tcPr>
+            <w:tcW w:type="dxa" w:w="1440"/>
+            <w:shd w:val="clear" w:fill="1F4E79"/>
+          </w:tcPr>
+          <w:p>
+            <w:pPr>
+              <w:spacing w:after="0"/>
+            </w:pPr>
+            <w:r/>
+            <w:r>
+              <w:rPr>
+                <w:rFonts w:ascii="Tahoma" w:hAnsi="Tahoma"/>
+                <w:b/>
+                <w:color w:val="FFFFFF"/>
+                <w:sz w:val="18"/>
+              </w:rPr>
+              <w:t>#sig สุดท้าย</w:t>
+            </w:r>
+          </w:p>
+        </w:tc>
+      </w:tr>
+      <w:tr>
+        <w:tc>
+          <w:tcPr>
+            <w:tcW w:type="dxa" w:w="2448"/>
+          </w:tcPr>
+          <w:p>
+            <w:pPr>
+              <w:spacing w:after="0"/>
+            </w:pPr>
+            <w:r/>
+            <w:r>
+              <w:rPr>
+                <w:rFonts w:ascii="Tahoma" w:hAnsi="Tahoma"/>
+                <w:b w:val="0"/>
+                <w:sz w:val="18"/>
+              </w:rPr>
+              <w:t>C0 เบสไลน์</w:t>
+            </w:r>
+          </w:p>
+        </w:tc>
+        <w:tc>
+          <w:tcPr>
+            <w:tcW w:type="dxa" w:w="864"/>
+          </w:tcPr>
+          <w:p>
+            <w:pPr>
+              <w:spacing w:after="0"/>
+            </w:pPr>
+            <w:r/>
+            <w:r>
+              <w:rPr>
+                <w:rFonts w:ascii="Tahoma" w:hAnsi="Tahoma"/>
+                <w:b w:val="0"/>
+                <w:sz w:val="18"/>
+              </w:rPr>
+              <w:t>3</w:t>
+            </w:r>
+          </w:p>
+        </w:tc>
+        <w:tc>
+          <w:tcPr>
+            <w:tcW w:type="dxa" w:w="2304"/>
+          </w:tcPr>
+          <w:p>
+            <w:pPr>
+              <w:spacing w:after="0"/>
+            </w:pPr>
+            <w:r/>
+            <w:r>
+              <w:rPr>
+                <w:rFonts w:ascii="Tahoma" w:hAnsi="Tahoma"/>
+                <w:b w:val="0"/>
+                <w:sz w:val="18"/>
+              </w:rPr>
+              <w:t>0.0426 ± 0.0012</w:t>
+            </w:r>
+          </w:p>
+        </w:tc>
+        <w:tc>
+          <w:tcPr>
+            <w:tcW w:type="dxa" w:w="1152"/>
+          </w:tcPr>
+          <w:p>
+            <w:pPr>
+              <w:spacing w:after="0"/>
+            </w:pPr>
+            <w:r/>
+            <w:r>
+              <w:rPr>
+                <w:rFonts w:ascii="Tahoma" w:hAnsi="Tahoma"/>
+                <w:b w:val="0"/>
+                <w:sz w:val="18"/>
+              </w:rPr>
+              <w:t>—</w:t>
+            </w:r>
+          </w:p>
+        </w:tc>
+        <w:tc>
+          <w:tcPr>
+            <w:tcW w:type="dxa" w:w="1296"/>
+          </w:tcPr>
+          <w:p>
+            <w:pPr>
+              <w:spacing w:after="0"/>
+            </w:pPr>
+            <w:r/>
+            <w:r>
+              <w:rPr>
+                <w:rFonts w:ascii="Tahoma" w:hAnsi="Tahoma"/>
+                <w:b w:val="0"/>
+                <w:sz w:val="18"/>
+              </w:rPr>
+              <w:t>0.641</w:t>
+            </w:r>
+          </w:p>
+        </w:tc>
+        <w:tc>
+          <w:tcPr>
+            <w:tcW w:type="dxa" w:w="1440"/>
+          </w:tcPr>
+          <w:p>
+            <w:pPr>
+              <w:spacing w:after="0"/>
+            </w:pPr>
+            <w:r/>
+            <w:r>
+              <w:rPr>
+                <w:rFonts w:ascii="Tahoma" w:hAnsi="Tahoma"/>
+                <w:b w:val="0"/>
+                <w:sz w:val="18"/>
+              </w:rPr>
+              <w:t>[2, 2, 2]</w:t>
+            </w:r>
+          </w:p>
+        </w:tc>
+      </w:tr>
+      <w:tr>
+        <w:tc>
+          <w:tcPr>
+            <w:tcW w:type="dxa" w:w="2448"/>
+          </w:tcPr>
+          <w:p>
+            <w:pPr>
+              <w:spacing w:after="0"/>
+            </w:pPr>
+            <w:r/>
+            <w:r>
+              <w:rPr>
+                <w:rFonts w:ascii="Tahoma" w:hAnsi="Tahoma"/>
+                <w:b w:val="0"/>
+                <w:sz w:val="18"/>
+              </w:rPr>
+              <w:t>C1 topological loss</w:t>
+            </w:r>
+          </w:p>
+        </w:tc>
+        <w:tc>
+          <w:tcPr>
+            <w:tcW w:type="dxa" w:w="864"/>
+          </w:tcPr>
+          <w:p>
+            <w:pPr>
+              <w:spacing w:after="0"/>
+            </w:pPr>
+            <w:r/>
+            <w:r>
+              <w:rPr>
+                <w:rFonts w:ascii="Tahoma" w:hAnsi="Tahoma"/>
+                <w:b w:val="0"/>
+                <w:sz w:val="18"/>
+              </w:rPr>
+              <w:t>3</w:t>
+            </w:r>
+          </w:p>
+        </w:tc>
+        <w:tc>
+          <w:tcPr>
+            <w:tcW w:type="dxa" w:w="2304"/>
+          </w:tcPr>
+          <w:p>
+            <w:pPr>
+              <w:spacing w:after="0"/>
+            </w:pPr>
+            <w:r/>
+            <w:r>
+              <w:rPr>
+                <w:rFonts w:ascii="Tahoma" w:hAnsi="Tahoma"/>
+                <w:b w:val="0"/>
+                <w:sz w:val="18"/>
+              </w:rPr>
+              <w:t>0.0208 ± 0.0008</w:t>
+            </w:r>
+          </w:p>
+        </w:tc>
+        <w:tc>
+          <w:tcPr>
+            <w:tcW w:type="dxa" w:w="1152"/>
+          </w:tcPr>
+          <w:p>
+            <w:pPr>
+              <w:spacing w:after="0"/>
+            </w:pPr>
+            <w:r/>
+            <w:r>
+              <w:rPr>
+                <w:rFonts w:ascii="Tahoma" w:hAnsi="Tahoma"/>
+                <w:b w:val="0"/>
+                <w:sz w:val="18"/>
+              </w:rPr>
+              <w:t>2.1×</w:t>
+            </w:r>
+          </w:p>
+        </w:tc>
+        <w:tc>
+          <w:tcPr>
+            <w:tcW w:type="dxa" w:w="1296"/>
+          </w:tcPr>
+          <w:p>
+            <w:pPr>
+              <w:spacing w:after="0"/>
+            </w:pPr>
+            <w:r/>
+            <w:r>
+              <w:rPr>
+                <w:rFonts w:ascii="Tahoma" w:hAnsi="Tahoma"/>
+                <w:b w:val="0"/>
+                <w:sz w:val="18"/>
+              </w:rPr>
+              <w:t>0.596</w:t>
+            </w:r>
+          </w:p>
+        </w:tc>
+        <w:tc>
+          <w:tcPr>
+            <w:tcW w:type="dxa" w:w="1440"/>
+          </w:tcPr>
+          <w:p>
+            <w:pPr>
+              <w:spacing w:after="0"/>
+            </w:pPr>
+            <w:r/>
+            <w:r>
+              <w:rPr>
+                <w:rFonts w:ascii="Tahoma" w:hAnsi="Tahoma"/>
+                <w:b w:val="0"/>
+                <w:sz w:val="18"/>
+              </w:rPr>
+              <w:t>[2, 2, 2]</w:t>
+            </w:r>
+          </w:p>
+        </w:tc>
+      </w:tr>
+      <w:tr>
+        <w:tc>
+          <w:tcPr>
+            <w:tcW w:type="dxa" w:w="2448"/>
+          </w:tcPr>
+          <w:p>
+            <w:pPr>
+              <w:spacing w:after="0"/>
+            </w:pPr>
+            <w:r/>
+            <w:r>
+              <w:rPr>
+                <w:rFonts w:ascii="Tahoma" w:hAnsi="Tahoma"/>
+                <w:b w:val="0"/>
+                <w:sz w:val="18"/>
+              </w:rPr>
+              <w:t>C2 ตัวควบคุม (repulsion)</w:t>
+            </w:r>
+          </w:p>
+        </w:tc>
+        <w:tc>
+          <w:tcPr>
+            <w:tcW w:type="dxa" w:w="864"/>
+          </w:tcPr>
+          <w:p>
+            <w:pPr>
+              <w:spacing w:after="0"/>
+            </w:pPr>
+            <w:r/>
+            <w:r>
+              <w:rPr>
+                <w:rFonts w:ascii="Tahoma" w:hAnsi="Tahoma"/>
+                <w:b w:val="0"/>
+                <w:sz w:val="18"/>
+              </w:rPr>
+              <w:t>3</w:t>
+            </w:r>
+          </w:p>
+        </w:tc>
+        <w:tc>
+          <w:tcPr>
+            <w:tcW w:type="dxa" w:w="2304"/>
+          </w:tcPr>
+          <w:p>
+            <w:pPr>
+              <w:spacing w:after="0"/>
+            </w:pPr>
+            <w:r/>
+            <w:r>
+              <w:rPr>
+                <w:rFonts w:ascii="Tahoma" w:hAnsi="Tahoma"/>
+                <w:b w:val="0"/>
+                <w:sz w:val="18"/>
+              </w:rPr>
+              <w:t>0.0437 ± 0.0000</w:t>
+            </w:r>
+          </w:p>
+        </w:tc>
+        <w:tc>
+          <w:tcPr>
+            <w:tcW w:type="dxa" w:w="1152"/>
+          </w:tcPr>
+          <w:p>
+            <w:pPr>
+              <w:spacing w:after="0"/>
+            </w:pPr>
+            <w:r/>
+            <w:r>
+              <w:rPr>
+                <w:rFonts w:ascii="Tahoma" w:hAnsi="Tahoma"/>
+                <w:b w:val="0"/>
+                <w:sz w:val="18"/>
+              </w:rPr>
+              <w:t>1.0×</w:t>
+            </w:r>
+          </w:p>
+        </w:tc>
+        <w:tc>
+          <w:tcPr>
+            <w:tcW w:type="dxa" w:w="1296"/>
+          </w:tcPr>
+          <w:p>
+            <w:pPr>
+              <w:spacing w:after="0"/>
+            </w:pPr>
+            <w:r/>
+            <w:r>
+              <w:rPr>
+                <w:rFonts w:ascii="Tahoma" w:hAnsi="Tahoma"/>
+                <w:b w:val="0"/>
+                <w:sz w:val="18"/>
+              </w:rPr>
+              <w:t>1.294</w:t>
+            </w:r>
+          </w:p>
+        </w:tc>
+        <w:tc>
+          <w:tcPr>
+            <w:tcW w:type="dxa" w:w="1440"/>
+          </w:tcPr>
+          <w:p>
+            <w:pPr>
+              <w:spacing w:after="0"/>
+            </w:pPr>
+            <w:r/>
+            <w:r>
+              <w:rPr>
+                <w:rFonts w:ascii="Tahoma" w:hAnsi="Tahoma"/>
+                <w:b w:val="0"/>
+                <w:sz w:val="18"/>
+              </w:rPr>
+              <w:t>[1, 1, 1]</w:t>
+            </w:r>
+          </w:p>
+        </w:tc>
+      </w:tr>
+    </w:tbl>
+    <w:p>
+      <w:pPr>
+        <w:spacing w:after="80"/>
+      </w:pPr>
+    </w:p>
+    <w:p>
+      <w:pPr>
+        <w:spacing w:after="120"/>
+      </w:pPr>
+      <w:r>
+        <w:rPr>
+          <w:rFonts w:ascii="Tahoma" w:hAnsi="Tahoma"/>
+          <w:sz w:val="19"/>
+        </w:rPr>
+        <w:t>คำตัดสิน (C1 ต้องชนะทั้ง C0 และตัวควบคุมทุกตัวที่ Chamfer parity): ผ่าน ✓ — C1 0.0208 vs C0 0.0426 (26.1 sigma); vs C2 0.0437; Chamfer 0.596 vs C0 0.641 (parity OK)</w:t>
+      </w:r>
+    </w:p>
+    <w:p>
+      <w:pPr>
+        <w:jc w:val="center"/>
+      </w:pPr>
+      <w:r>
+        <w:drawing>
+          <wp:inline xmlns:a="http://schemas.openxmlformats.org/drawingml/2006/main" xmlns:pic="http://schemas.openxmlformats.org/drawingml/2006/picture">
+            <wp:extent cx="5303520" cy="3182112"/>
+            <wp:docPr id="13" name="Picture 13"/>
+            <wp:cNvGraphicFramePr>
+              <a:graphicFrameLocks noChangeAspect="1"/>
+            </wp:cNvGraphicFramePr>
+            <a:graphic>
+              <a:graphicData uri="http://schemas.openxmlformats.org/drawingml/2006/picture">
+                <pic:pic>
+                  <pic:nvPicPr>
+                    <pic:cNvPr id="0" name="bob_series.png"/>
+                    <pic:cNvPicPr/>
+                  </pic:nvPicPr>
+                  <pic:blipFill>
+                    <a:blip r:embed="rId21"/>
+                    <a:stretch>
+                      <a:fillRect/>
+                    </a:stretch>
+                  </pic:blipFill>
+                  <pic:spPr>
+                    <a:xfrm>
+                      <a:off x="0" y="0"/>
+                      <a:ext cx="5303520" cy="3182112"/>
+                    </a:xfrm>
+                    <a:prstGeom prst="rect"/>
+                  </pic:spPr>
+                </pic:pic>
+              </a:graphicData>
+            </a:graphic>
+          </wp:inline>
+        </w:drawing>
+      </w:r>
+    </w:p>
+    <w:p>
+      <w:pPr>
+        <w:jc w:val="center"/>
+      </w:pPr>
+      <w:r>
+        <w:rPr>
+          <w:i/>
+          <w:color w:val="555555"/>
+          <w:sz w:val="17"/>
+        </w:rPr>
+        <w:t>bob — โมเดลเป็ด genus-1 (Crane, CC0) — ค่า error เชิงโทโพโลยีระหว่างการเทรน (แถบ = ช่วง min–max ข้าม seeds)</w:t>
+      </w:r>
+    </w:p>
+    <w:p>
+      <w:pPr>
+        <w:jc w:val="center"/>
+      </w:pPr>
+      <w:r>
+        <w:drawing>
+          <wp:inline xmlns:a="http://schemas.openxmlformats.org/drawingml/2006/main" xmlns:pic="http://schemas.openxmlformats.org/drawingml/2006/picture">
+            <wp:extent cx="5303520" cy="2727525"/>
+            <wp:docPr id="14" name="Picture 14"/>
+            <wp:cNvGraphicFramePr>
+              <a:graphicFrameLocks noChangeAspect="1"/>
+            </wp:cNvGraphicFramePr>
+            <a:graphic>
+              <a:graphicData uri="http://schemas.openxmlformats.org/drawingml/2006/picture">
+                <pic:pic>
+                  <pic:nvPicPr>
+                    <pic:cNvPr id="0" name="bob_nsig.png"/>
+                    <pic:cNvPicPr/>
+                  </pic:nvPicPr>
+                  <pic:blipFill>
+                    <a:blip r:embed="rId22"/>
+                    <a:stretch>
+                      <a:fillRect/>
+                    </a:stretch>
+                  </pic:blipFill>
+                  <pic:spPr>
+                    <a:xfrm>
+                      <a:off x="0" y="0"/>
+                      <a:ext cx="5303520" cy="2727525"/>
+                    </a:xfrm>
+                    <a:prstGeom prst="rect"/>
+                  </pic:spPr>
+                </pic:pic>
+              </a:graphicData>
+            </a:graphic>
+          </wp:inline>
+        </w:drawing>
+      </w:r>
+    </w:p>
+    <w:p>
+      <w:pPr>
+        <w:jc w:val="center"/>
+      </w:pPr>
+      <w:r>
+        <w:rPr>
+          <w:i/>
+          <w:color w:val="555555"/>
+          <w:sz w:val="17"/>
+        </w:rPr>
+        <w:t>bob — โมเดลเป็ด genus-1 (Crane, CC0) — จำนวน feature ที่มีนัยยะ (เช็ค phantom; เส้นประ = ค่าที่ถูกต้อง)</w:t>
+      </w:r>
+    </w:p>
+    <w:p>
+      <w:pPr>
+        <w:pStyle w:val="Heading2"/>
+      </w:pPr>
+      <w:r>
+        <w:rPr>
+          <w:rFonts w:ascii="Tahoma" w:hAnsi="Tahoma"/>
+          <w:color w:val="1F4E79"/>
+        </w:rPr>
+        <w:t>4.8 fandisk — ชิ้นงาน CAD genus-0 — มิติชี้ขาด H2 (โพรงปิด/voids)</w:t>
+      </w:r>
+    </w:p>
+    <w:tbl>
+      <w:tblPr>
+        <w:tblStyle w:val="TableGrid"/>
+        <w:tblW w:type="auto" w:w="0"/>
+        <w:jc w:val="center"/>
+        <w:tblLook w:firstColumn="1" w:firstRow="1" w:lastColumn="0" w:lastRow="0" w:noHBand="0" w:noVBand="1" w:val="04A0"/>
+      </w:tblPr>
+      <w:tblGrid>
+        <w:gridCol w:w="1440"/>
+        <w:gridCol w:w="1440"/>
+        <w:gridCol w:w="1440"/>
+        <w:gridCol w:w="1440"/>
+        <w:gridCol w:w="1440"/>
+        <w:gridCol w:w="1440"/>
+      </w:tblGrid>
+      <w:tr>
+        <w:tc>
+          <w:tcPr>
+            <w:tcW w:type="dxa" w:w="2448"/>
+            <w:shd w:val="clear" w:fill="1F4E79"/>
+          </w:tcPr>
+          <w:p>
+            <w:pPr>
+              <w:spacing w:after="0"/>
+            </w:pPr>
+            <w:r/>
+            <w:r>
+              <w:rPr>
+                <w:rFonts w:ascii="Tahoma" w:hAnsi="Tahoma"/>
+                <w:b/>
+                <w:color w:val="FFFFFF"/>
+                <w:sz w:val="18"/>
+              </w:rPr>
+              <w:t>เงื่อนไข</w:t>
+            </w:r>
+          </w:p>
+        </w:tc>
+        <w:tc>
+          <w:tcPr>
+            <w:tcW w:type="dxa" w:w="864"/>
+            <w:shd w:val="clear" w:fill="1F4E79"/>
+          </w:tcPr>
+          <w:p>
+            <w:pPr>
+              <w:spacing w:after="0"/>
+            </w:pPr>
+            <w:r/>
+            <w:r>
+              <w:rPr>
+                <w:rFonts w:ascii="Tahoma" w:hAnsi="Tahoma"/>
+                <w:b/>
+                <w:color w:val="FFFFFF"/>
+                <w:sz w:val="18"/>
+              </w:rPr>
+              <w:t>seeds</w:t>
+            </w:r>
+          </w:p>
+        </w:tc>
+        <w:tc>
+          <w:tcPr>
+            <w:tcW w:type="dxa" w:w="2304"/>
+            <w:shd w:val="clear" w:fill="1F4E79"/>
+          </w:tcPr>
+          <w:p>
+            <w:pPr>
+              <w:spacing w:after="0"/>
+            </w:pPr>
+            <w:r/>
+            <w:r>
+              <w:rPr>
+                <w:rFonts w:ascii="Tahoma" w:hAnsi="Tahoma"/>
+                <w:b/>
+                <w:color w:val="FFFFFF"/>
+                <w:sz w:val="18"/>
+              </w:rPr>
+              <w:t>bottleneck H2 (ท้ายการเทรน)</w:t>
+            </w:r>
+          </w:p>
+        </w:tc>
+        <w:tc>
+          <w:tcPr>
+            <w:tcW w:type="dxa" w:w="1152"/>
+            <w:shd w:val="clear" w:fill="1F4E79"/>
+          </w:tcPr>
+          <w:p>
+            <w:pPr>
+              <w:spacing w:after="0"/>
+            </w:pPr>
+            <w:r/>
+            <w:r>
+              <w:rPr>
+                <w:rFonts w:ascii="Tahoma" w:hAnsi="Tahoma"/>
+                <w:b/>
+                <w:color w:val="FFFFFF"/>
+                <w:sz w:val="18"/>
+              </w:rPr>
+              <w:t>เทียบ C0</w:t>
+            </w:r>
+          </w:p>
+        </w:tc>
+        <w:tc>
+          <w:tcPr>
+            <w:tcW w:type="dxa" w:w="1296"/>
+            <w:shd w:val="clear" w:fill="1F4E79"/>
+          </w:tcPr>
+          <w:p>
+            <w:pPr>
+              <w:spacing w:after="0"/>
+            </w:pPr>
+            <w:r/>
+            <w:r>
+              <w:rPr>
+                <w:rFonts w:ascii="Tahoma" w:hAnsi="Tahoma"/>
+                <w:b/>
+                <w:color w:val="FFFFFF"/>
+                <w:sz w:val="18"/>
+              </w:rPr>
+              <w:t>Chamfer%</w:t>
+            </w:r>
+          </w:p>
+        </w:tc>
+        <w:tc>
+          <w:tcPr>
+            <w:tcW w:type="dxa" w:w="1440"/>
+            <w:shd w:val="clear" w:fill="1F4E79"/>
+          </w:tcPr>
+          <w:p>
+            <w:pPr>
+              <w:spacing w:after="0"/>
+            </w:pPr>
+            <w:r/>
+            <w:r>
+              <w:rPr>
+                <w:rFonts w:ascii="Tahoma" w:hAnsi="Tahoma"/>
+                <w:b/>
+                <w:color w:val="FFFFFF"/>
+                <w:sz w:val="18"/>
+              </w:rPr>
+              <w:t>#sig สุดท้าย</w:t>
+            </w:r>
+          </w:p>
+        </w:tc>
+      </w:tr>
+      <w:tr>
+        <w:tc>
+          <w:tcPr>
+            <w:tcW w:type="dxa" w:w="2448"/>
+          </w:tcPr>
+          <w:p>
+            <w:pPr>
+              <w:spacing w:after="0"/>
+            </w:pPr>
+            <w:r/>
+            <w:r>
+              <w:rPr>
+                <w:rFonts w:ascii="Tahoma" w:hAnsi="Tahoma"/>
+                <w:b w:val="0"/>
+                <w:sz w:val="18"/>
+              </w:rPr>
+              <w:t>C0 เบสไลน์</w:t>
+            </w:r>
+          </w:p>
+        </w:tc>
+        <w:tc>
+          <w:tcPr>
+            <w:tcW w:type="dxa" w:w="864"/>
+          </w:tcPr>
+          <w:p>
+            <w:pPr>
+              <w:spacing w:after="0"/>
+            </w:pPr>
+            <w:r/>
+            <w:r>
+              <w:rPr>
+                <w:rFonts w:ascii="Tahoma" w:hAnsi="Tahoma"/>
+                <w:b w:val="0"/>
+                <w:sz w:val="18"/>
+              </w:rPr>
+              <w:t>3</w:t>
+            </w:r>
+          </w:p>
+        </w:tc>
+        <w:tc>
+          <w:tcPr>
+            <w:tcW w:type="dxa" w:w="2304"/>
+          </w:tcPr>
+          <w:p>
+            <w:pPr>
+              <w:spacing w:after="0"/>
+            </w:pPr>
+            <w:r/>
+            <w:r>
+              <w:rPr>
+                <w:rFonts w:ascii="Tahoma" w:hAnsi="Tahoma"/>
+                <w:b w:val="0"/>
+                <w:sz w:val="18"/>
+              </w:rPr>
+              <w:t>0.0538 ± 0.0022</w:t>
+            </w:r>
+          </w:p>
+        </w:tc>
+        <w:tc>
+          <w:tcPr>
+            <w:tcW w:type="dxa" w:w="1152"/>
+          </w:tcPr>
+          <w:p>
+            <w:pPr>
+              <w:spacing w:after="0"/>
+            </w:pPr>
+            <w:r/>
+            <w:r>
+              <w:rPr>
+                <w:rFonts w:ascii="Tahoma" w:hAnsi="Tahoma"/>
+                <w:b w:val="0"/>
+                <w:sz w:val="18"/>
+              </w:rPr>
+              <w:t>—</w:t>
+            </w:r>
+          </w:p>
+        </w:tc>
+        <w:tc>
+          <w:tcPr>
+            <w:tcW w:type="dxa" w:w="1296"/>
+          </w:tcPr>
+          <w:p>
+            <w:pPr>
+              <w:spacing w:after="0"/>
+            </w:pPr>
+            <w:r/>
+            <w:r>
+              <w:rPr>
+                <w:rFonts w:ascii="Tahoma" w:hAnsi="Tahoma"/>
+                <w:b w:val="0"/>
+                <w:sz w:val="18"/>
+              </w:rPr>
+              <w:t>1.111</w:t>
+            </w:r>
+          </w:p>
+        </w:tc>
+        <w:tc>
+          <w:tcPr>
+            <w:tcW w:type="dxa" w:w="1440"/>
+          </w:tcPr>
+          <w:p>
+            <w:pPr>
+              <w:spacing w:after="0"/>
+            </w:pPr>
+            <w:r/>
+            <w:r>
+              <w:rPr>
+                <w:rFonts w:ascii="Tahoma" w:hAnsi="Tahoma"/>
+                <w:b w:val="0"/>
+                <w:sz w:val="18"/>
+              </w:rPr>
+              <w:t>[1, 1, 1]</w:t>
+            </w:r>
+          </w:p>
+        </w:tc>
+      </w:tr>
+      <w:tr>
+        <w:tc>
+          <w:tcPr>
+            <w:tcW w:type="dxa" w:w="2448"/>
+          </w:tcPr>
+          <w:p>
+            <w:pPr>
+              <w:spacing w:after="0"/>
+            </w:pPr>
+            <w:r/>
+            <w:r>
+              <w:rPr>
+                <w:rFonts w:ascii="Tahoma" w:hAnsi="Tahoma"/>
+                <w:b w:val="0"/>
+                <w:sz w:val="18"/>
+              </w:rPr>
+              <w:t>C1 topological loss</w:t>
+            </w:r>
+          </w:p>
+        </w:tc>
+        <w:tc>
+          <w:tcPr>
+            <w:tcW w:type="dxa" w:w="864"/>
+          </w:tcPr>
+          <w:p>
+            <w:pPr>
+              <w:spacing w:after="0"/>
+            </w:pPr>
+            <w:r/>
+            <w:r>
+              <w:rPr>
+                <w:rFonts w:ascii="Tahoma" w:hAnsi="Tahoma"/>
+                <w:b w:val="0"/>
+                <w:sz w:val="18"/>
+              </w:rPr>
+              <w:t>3</w:t>
+            </w:r>
+          </w:p>
+        </w:tc>
+        <w:tc>
+          <w:tcPr>
+            <w:tcW w:type="dxa" w:w="2304"/>
+          </w:tcPr>
+          <w:p>
+            <w:pPr>
+              <w:spacing w:after="0"/>
+            </w:pPr>
+            <w:r/>
+            <w:r>
+              <w:rPr>
+                <w:rFonts w:ascii="Tahoma" w:hAnsi="Tahoma"/>
+                <w:b w:val="0"/>
+                <w:sz w:val="18"/>
+              </w:rPr>
+              <w:t>0.0052 ± 0.0008</w:t>
+            </w:r>
+          </w:p>
+        </w:tc>
+        <w:tc>
+          <w:tcPr>
+            <w:tcW w:type="dxa" w:w="1152"/>
+          </w:tcPr>
+          <w:p>
+            <w:pPr>
+              <w:spacing w:after="0"/>
+            </w:pPr>
+            <w:r/>
+            <w:r>
+              <w:rPr>
+                <w:rFonts w:ascii="Tahoma" w:hAnsi="Tahoma"/>
+                <w:b w:val="0"/>
+                <w:sz w:val="18"/>
+              </w:rPr>
+              <w:t>10.4×</w:t>
+            </w:r>
+          </w:p>
+        </w:tc>
+        <w:tc>
+          <w:tcPr>
+            <w:tcW w:type="dxa" w:w="1296"/>
+          </w:tcPr>
+          <w:p>
+            <w:pPr>
+              <w:spacing w:after="0"/>
+            </w:pPr>
+            <w:r/>
+            <w:r>
+              <w:rPr>
+                <w:rFonts w:ascii="Tahoma" w:hAnsi="Tahoma"/>
+                <w:b w:val="0"/>
+                <w:sz w:val="18"/>
+              </w:rPr>
+              <w:t>1.001</w:t>
+            </w:r>
+          </w:p>
+        </w:tc>
+        <w:tc>
+          <w:tcPr>
+            <w:tcW w:type="dxa" w:w="1440"/>
+          </w:tcPr>
+          <w:p>
+            <w:pPr>
+              <w:spacing w:after="0"/>
+            </w:pPr>
+            <w:r/>
+            <w:r>
+              <w:rPr>
+                <w:rFonts w:ascii="Tahoma" w:hAnsi="Tahoma"/>
+                <w:b w:val="0"/>
+                <w:sz w:val="18"/>
+              </w:rPr>
+              <w:t>[1, 1, 1]</w:t>
+            </w:r>
+          </w:p>
+        </w:tc>
+      </w:tr>
+      <w:tr>
+        <w:tc>
+          <w:tcPr>
+            <w:tcW w:type="dxa" w:w="2448"/>
+          </w:tcPr>
+          <w:p>
+            <w:pPr>
+              <w:spacing w:after="0"/>
+            </w:pPr>
+            <w:r/>
+            <w:r>
+              <w:rPr>
+                <w:rFonts w:ascii="Tahoma" w:hAnsi="Tahoma"/>
+                <w:b w:val="0"/>
+                <w:sz w:val="18"/>
+              </w:rPr>
+              <w:t>C2 ตัวควบคุม (repulsion)</w:t>
+            </w:r>
+          </w:p>
+        </w:tc>
+        <w:tc>
+          <w:tcPr>
+            <w:tcW w:type="dxa" w:w="864"/>
+          </w:tcPr>
+          <w:p>
+            <w:pPr>
+              <w:spacing w:after="0"/>
+            </w:pPr>
+            <w:r/>
+            <w:r>
+              <w:rPr>
+                <w:rFonts w:ascii="Tahoma" w:hAnsi="Tahoma"/>
+                <w:b w:val="0"/>
+                <w:sz w:val="18"/>
+              </w:rPr>
+              <w:t>3</w:t>
+            </w:r>
+          </w:p>
+        </w:tc>
+        <w:tc>
+          <w:tcPr>
+            <w:tcW w:type="dxa" w:w="2304"/>
+          </w:tcPr>
+          <w:p>
+            <w:pPr>
+              <w:spacing w:after="0"/>
+            </w:pPr>
+            <w:r/>
+            <w:r>
+              <w:rPr>
+                <w:rFonts w:ascii="Tahoma" w:hAnsi="Tahoma"/>
+                <w:b w:val="0"/>
+                <w:sz w:val="18"/>
+              </w:rPr>
+              <w:t>0.0571 ± 0.0000</w:t>
+            </w:r>
+          </w:p>
+        </w:tc>
+        <w:tc>
+          <w:tcPr>
+            <w:tcW w:type="dxa" w:w="1152"/>
+          </w:tcPr>
+          <w:p>
+            <w:pPr>
+              <w:spacing w:after="0"/>
+            </w:pPr>
+            <w:r/>
+            <w:r>
+              <w:rPr>
+                <w:rFonts w:ascii="Tahoma" w:hAnsi="Tahoma"/>
+                <w:b w:val="0"/>
+                <w:sz w:val="18"/>
+              </w:rPr>
+              <w:t>0.9×</w:t>
+            </w:r>
+          </w:p>
+        </w:tc>
+        <w:tc>
+          <w:tcPr>
+            <w:tcW w:type="dxa" w:w="1296"/>
+          </w:tcPr>
+          <w:p>
+            <w:pPr>
+              <w:spacing w:after="0"/>
+            </w:pPr>
+            <w:r/>
+            <w:r>
+              <w:rPr>
+                <w:rFonts w:ascii="Tahoma" w:hAnsi="Tahoma"/>
+                <w:b w:val="0"/>
+                <w:sz w:val="18"/>
+              </w:rPr>
+              <w:t>1.627</w:t>
+            </w:r>
+          </w:p>
+        </w:tc>
+        <w:tc>
+          <w:tcPr>
+            <w:tcW w:type="dxa" w:w="1440"/>
+          </w:tcPr>
+          <w:p>
+            <w:pPr>
+              <w:spacing w:after="0"/>
+            </w:pPr>
+            <w:r/>
+            <w:r>
+              <w:rPr>
+                <w:rFonts w:ascii="Tahoma" w:hAnsi="Tahoma"/>
+                <w:b w:val="0"/>
+                <w:sz w:val="18"/>
+              </w:rPr>
+              <w:t>[0, 0, 0]</w:t>
+            </w:r>
+          </w:p>
+        </w:tc>
+      </w:tr>
+    </w:tbl>
+    <w:p>
+      <w:pPr>
+        <w:spacing w:after="80"/>
+      </w:pPr>
+    </w:p>
+    <w:p>
+      <w:pPr>
+        <w:spacing w:after="120"/>
+      </w:pPr>
+      <w:r>
+        <w:rPr>
+          <w:rFonts w:ascii="Tahoma" w:hAnsi="Tahoma"/>
+          <w:sz w:val="19"/>
+        </w:rPr>
+        <w:t>คำตัดสิน (C1 ต้องชนะทั้ง C0 และตัวควบคุมทุกตัวที่ Chamfer parity): ผ่าน ✓ — C1 0.0052 vs C0 0.0538 (35.7 sigma); vs C2 0.0571; Chamfer 1.001 vs C0 1.111 (parity OK)</w:t>
+      </w:r>
+    </w:p>
+    <w:p>
+      <w:pPr>
+        <w:jc w:val="center"/>
+      </w:pPr>
+      <w:r>
+        <w:drawing>
+          <wp:inline xmlns:a="http://schemas.openxmlformats.org/drawingml/2006/main" xmlns:pic="http://schemas.openxmlformats.org/drawingml/2006/picture">
+            <wp:extent cx="5303520" cy="3182112"/>
+            <wp:docPr id="15" name="Picture 15"/>
+            <wp:cNvGraphicFramePr>
+              <a:graphicFrameLocks noChangeAspect="1"/>
+            </wp:cNvGraphicFramePr>
+            <a:graphic>
+              <a:graphicData uri="http://schemas.openxmlformats.org/drawingml/2006/picture">
+                <pic:pic>
+                  <pic:nvPicPr>
+                    <pic:cNvPr id="0" name="fandisk_series.png"/>
+                    <pic:cNvPicPr/>
+                  </pic:nvPicPr>
+                  <pic:blipFill>
+                    <a:blip r:embed="rId23"/>
+                    <a:stretch>
+                      <a:fillRect/>
+                    </a:stretch>
+                  </pic:blipFill>
+                  <pic:spPr>
+                    <a:xfrm>
+                      <a:off x="0" y="0"/>
+                      <a:ext cx="5303520" cy="3182112"/>
+                    </a:xfrm>
+                    <a:prstGeom prst="rect"/>
+                  </pic:spPr>
+                </pic:pic>
+              </a:graphicData>
+            </a:graphic>
+          </wp:inline>
+        </w:drawing>
+      </w:r>
+    </w:p>
+    <w:p>
+      <w:pPr>
+        <w:jc w:val="center"/>
+      </w:pPr>
+      <w:r>
+        <w:rPr>
+          <w:i/>
+          <w:color w:val="555555"/>
+          <w:sz w:val="17"/>
+        </w:rPr>
+        <w:t>fandisk — ชิ้นงาน CAD genus-0 — ค่า error เชิงโทโพโลยีระหว่างการเทรน (แถบ = ช่วง min–max ข้าม seeds)</w:t>
+      </w:r>
+    </w:p>
+    <w:p>
+      <w:pPr>
+        <w:jc w:val="center"/>
+      </w:pPr>
+      <w:r>
+        <w:drawing>
+          <wp:inline xmlns:a="http://schemas.openxmlformats.org/drawingml/2006/main" xmlns:pic="http://schemas.openxmlformats.org/drawingml/2006/picture">
+            <wp:extent cx="5303520" cy="2727525"/>
+            <wp:docPr id="16" name="Picture 16"/>
+            <wp:cNvGraphicFramePr>
+              <a:graphicFrameLocks noChangeAspect="1"/>
+            </wp:cNvGraphicFramePr>
+            <a:graphic>
+              <a:graphicData uri="http://schemas.openxmlformats.org/drawingml/2006/picture">
+                <pic:pic>
+                  <pic:nvPicPr>
+                    <pic:cNvPr id="0" name="fandisk_nsig.png"/>
+                    <pic:cNvPicPr/>
+                  </pic:nvPicPr>
+                  <pic:blipFill>
+                    <a:blip r:embed="rId24"/>
+                    <a:stretch>
+                      <a:fillRect/>
+                    </a:stretch>
+                  </pic:blipFill>
+                  <pic:spPr>
+                    <a:xfrm>
+                      <a:off x="0" y="0"/>
+                      <a:ext cx="5303520" cy="2727525"/>
+                    </a:xfrm>
+                    <a:prstGeom prst="rect"/>
+                  </pic:spPr>
+                </pic:pic>
+              </a:graphicData>
+            </a:graphic>
+          </wp:inline>
+        </w:drawing>
+      </w:r>
+    </w:p>
+    <w:p>
+      <w:pPr>
+        <w:jc w:val="center"/>
+      </w:pPr>
+      <w:r>
+        <w:rPr>
+          <w:i/>
+          <w:color w:val="555555"/>
+          <w:sz w:val="17"/>
+        </w:rPr>
+        <w:t>fandisk — ชิ้นงาน CAD genus-0 — จำนวน feature ที่มีนัยยะ (เช็ค phantom; เส้นประ = ค่าที่ถูกต้อง)</w:t>
+      </w:r>
+    </w:p>
+    <w:p>
+      <w:pPr>
         <w:pStyle w:val="Heading1"/>
       </w:pPr>
       <w:r>
@@ -4573,7 +6472,7 @@
           <w:rFonts w:ascii="Tahoma" w:hAnsi="Tahoma"/>
           <w:color w:val="1F4E79"/>
         </w:rPr>
-        <w:t>5. ข้อค้นพบหลักสี่ข้อ</w:t>
+        <w:t>5. ข้อค้นพบหลักห้าข้อ</w:t>
       </w:r>
     </w:p>
     <w:p>
@@ -4622,6 +6521,18 @@
           <w:sz w:val="21"/>
         </w:rPr>
         <w:t>④ curriculum ไม่จำเป็นเมื่อปรับเทียบ λ ด้วยอัตราส่วน gradient (C3 ≈ C1 ทั้งสองรูปทรงชี้ขาด) — สิ่งที่ทำให้ปุ่มความแรงปลอดภัยคือ calibration ไม่ใช่ตารางเวลา (ตอบข้อกังวล gradient explode ของอาจารย์ด้วยข้อมูล)</w:t>
+      </w:r>
+    </w:p>
+    <w:p>
+      <w:pPr>
+        <w:pStyle w:val="ListBullet"/>
+      </w:pPr>
+      <w:r>
+        <w:rPr>
+          <w:rFonts w:ascii="Tahoma" w:hAnsi="Tahoma"/>
+          <w:sz w:val="21"/>
+        </w:rPr>
+        <w:t>⑤ ความทั่วไป (คลื่น 3e): ทุก verdict เกิดซ้ำบนเมชภายนอกสามชิ้นโดยไม่จูนต่อรูปทรง — spot 2.2 เท่า (6.1σ), bob 2.0 เท่า (26.1σ; phantom handle = ศูนย์ทุก seed — ผล H1 อยู่รอดนอกตระกูล analytic), fandisk 10.3 เท่า (35.7σ — ผลใหญ่ที่สุดในการศึกษา) — ข้อสรุปไม่ใช่ artifact ของตระกูลรูปทรงสังเคราะห์</w:t>
       </w:r>
     </w:p>
     <w:p>
@@ -4681,7 +6592,7 @@
           <w:rFonts w:ascii="Tahoma" w:hAnsi="Tahoma"/>
           <w:sz w:val="21"/>
         </w:rPr>
-        <w:t>ยังจำกัดที่รูปทรงสังเคราะห์พื้นผิวปิด เรนเดอร์ 200×200 เครื่องเดียว — ShapeNet และข้อมูล ทันตกรรมจริงเป็นขั้นถัดไป (ตามลำดับที่ตกลงกับอาจารย์)</w:t>
+        <w:t>ยังจำกัดที่การเรนเดอร์สังเคราะห์พื้นผิวปิดเครื่องเดียว (200–256 px, 24–72 มุมมอง) — คลื่น 3e ขยายจากตระกูล analytic ไปเมชภายนอกสามชิ้นแล้ว แต่ยังไม่ถึงชุดรูปทรงสาธารณะ ขนาดใหญ่; ข้อมูลทันตกรรมจริงเป็นขั้นถัดไป (ตามลำดับที่ตกลงกับอาจารย์)</w:t>
       </w:r>
     </w:p>
     <w:p>
@@ -4717,7 +6628,7 @@
           <w:rFonts w:ascii="Tahoma" w:hAnsi="Tahoma"/>
           <w:sz w:val="21"/>
         </w:rPr>
-        <w:t>ShapeNet subset (mesh ที่รู้ genus) เพื่อความทั่วไป → ป้อน paper ฉบับที่ 2 (Topology-Correcting Differentiable Rendering via Persistent Homology)</w:t>
+        <w:t>ความทั่วไป: ทำแล้ว (คลื่น 3e — spot/bob/fandisk แทน ShapeNet ที่เมชส่วนใหญ่ ไม่ watertight) และเขียนเข้า paper ฉบับที่ 2 แล้ว (paper2/ ร่างสมบูรณ์: บทคัดย่อ ตาราง และรูปครบ); ชุดรูปทรงสาธารณะที่กว้างขึ้นค่อยเพิ่มถ้าผู้ตรวจต้องการ</w:t>
       </w:r>
     </w:p>
     <w:p>

</xml_diff>